<commit_message>
Visual Studo Code: Update resume dates for Entry Level Computer Operator Administrator position
</commit_message>
<xml_diff>
--- a/Résumé/RaymondLei_Resume2025 - 1.docx
+++ b/Résumé/RaymondLei_Resume2025 - 1.docx
@@ -699,7 +699,7 @@
                                     </pic:cNvPicPr>
                                   </pic:nvPicPr>
                                   <pic:blipFill>
-                                    <a:blip r:embed="rId8"/>
+                                    <a:blip r:embed="rId16"/>
                                     <a:srcRect/>
                                     <a:stretch>
                                       <a:fillRect/>
@@ -833,7 +833,7 @@
                                     </pic:cNvPicPr>
                                   </pic:nvPicPr>
                                   <pic:blipFill>
-                                    <a:blip r:embed="rId9"/>
+                                    <a:blip r:embed="rId17"/>
                                     <a:srcRect/>
                                     <a:stretch>
                                       <a:fillRect/>
@@ -871,7 +871,7 @@
                         </w:rPr>
                         <w:t xml:space="preserve"> </w:t>
                       </w:r>
-                      <w:hyperlink r:id="rId16" w:history="1">
+                      <w:hyperlink r:id="rId18" w:history="1">
                         <w:r>
                           <w:rPr>
                             <w:rStyle w:val="Hyperlink"/>
@@ -920,7 +920,7 @@
                                     </pic:cNvPicPr>
                                   </pic:nvPicPr>
                                   <pic:blipFill>
-                                    <a:blip r:embed="rId11"/>
+                                    <a:blip r:embed="rId19"/>
                                     <a:srcRect/>
                                     <a:stretch>
                                       <a:fillRect/>
@@ -1017,7 +1017,7 @@
                                     </pic:cNvPicPr>
                                   </pic:nvPicPr>
                                   <pic:blipFill>
-                                    <a:blip r:embed="rId12"/>
+                                    <a:blip r:embed="rId20"/>
                                     <a:srcRect/>
                                     <a:stretch>
                                       <a:fillRect/>
@@ -1045,7 +1045,7 @@
                           </wp:inline>
                         </w:drawing>
                       </w:r>
-                      <w:hyperlink r:id="rId17" w:history="1">
+                      <w:hyperlink r:id="rId21" w:history="1">
                         <w:r>
                           <w:rPr>
                             <w:rStyle w:val="Hyperlink"/>
@@ -1091,7 +1091,7 @@
                                     </pic:cNvPicPr>
                                   </pic:nvPicPr>
                                   <pic:blipFill>
-                                    <a:blip r:embed="rId14"/>
+                                    <a:blip r:embed="rId22"/>
                                     <a:srcRect/>
                                     <a:stretch>
                                       <a:fillRect/>
@@ -1119,7 +1119,7 @@
                           </wp:inline>
                         </w:drawing>
                       </w:r>
-                      <w:hyperlink r:id="rId18" w:history="1">
+                      <w:hyperlink r:id="rId23" w:history="1">
                         <w:r>
                           <w:rPr>
                             <w:rStyle w:val="Hyperlink"/>
@@ -5168,6 +5168,48 @@
           <w:rFonts w:asciiTheme="minorHAnsi" w:hAnsiTheme="minorHAnsi" w:cstheme="minorBidi"/>
           <w:b/>
         </w:rPr>
+        <w:t>2</w:t>
+      </w:r>
+      <w:r>
+        <w:rPr>
+          <w:rFonts w:asciiTheme="minorHAnsi" w:hAnsiTheme="minorHAnsi" w:cstheme="minorBidi"/>
+          <w:b/>
+        </w:rPr>
+        <w:t>/</w:t>
+      </w:r>
+      <w:r>
+        <w:rPr>
+          <w:rFonts w:asciiTheme="minorHAnsi" w:hAnsiTheme="minorHAnsi" w:cstheme="minorBidi"/>
+          <w:b/>
+        </w:rPr>
+        <w:t>20</w:t>
+      </w:r>
+      <w:r>
+        <w:rPr>
+          <w:rFonts w:asciiTheme="minorHAnsi" w:hAnsiTheme="minorHAnsi" w:cstheme="minorBidi"/>
+          <w:b/>
+        </w:rPr>
+        <w:t>19</w:t>
+      </w:r>
+      <w:r>
+        <w:rPr>
+          <w:rFonts w:asciiTheme="minorHAnsi" w:hAnsiTheme="minorHAnsi" w:cstheme="minorBidi"/>
+          <w:b/>
+        </w:rPr>
+        <w:t xml:space="preserve"> – </w:t>
+      </w:r>
+      <w:r>
+        <w:rPr>
+          <w:rFonts w:asciiTheme="minorHAnsi" w:hAnsiTheme="minorHAnsi" w:cstheme="minorBidi"/>
+          <w:b/>
+        </w:rPr>
+        <w:t>0</w:t>
+      </w:r>
+      <w:r>
+        <w:rPr>
+          <w:rFonts w:asciiTheme="minorHAnsi" w:hAnsiTheme="minorHAnsi" w:cstheme="minorBidi"/>
+          <w:b/>
+        </w:rPr>
         <w:t>7</w:t>
       </w:r>
       <w:r>
@@ -5182,21 +5224,14 @@
           <w:rFonts w:asciiTheme="minorHAnsi" w:hAnsiTheme="minorHAnsi" w:cstheme="minorBidi"/>
           <w:b/>
         </w:rPr>
-        <w:t>2021</w:t>
-      </w:r>
-      <w:r>
-        <w:rPr>
-          <w:rFonts w:asciiTheme="minorHAnsi" w:hAnsiTheme="minorHAnsi" w:cstheme="minorBidi"/>
-          <w:b/>
-        </w:rPr>
-        <w:t xml:space="preserve"> – </w:t>
-      </w:r>
-      <w:r>
-        <w:rPr>
-          <w:rFonts w:asciiTheme="minorHAnsi" w:hAnsiTheme="minorHAnsi" w:cstheme="minorBidi"/>
-          <w:b/>
-        </w:rPr>
-        <w:t>09/2023</w:t>
+        <w:t>20</w:t>
+      </w:r>
+      <w:r>
+        <w:rPr>
+          <w:rFonts w:asciiTheme="minorHAnsi" w:hAnsiTheme="minorHAnsi" w:cstheme="minorBidi"/>
+          <w:b/>
+        </w:rPr>
+        <w:t>19</w:t>
       </w:r>
     </w:p>
     <w:p>
@@ -7678,6 +7713,7 @@
   <w:style w:type="character" w:default="1" w:styleId="DefaultParagraphFont">
     <w:name w:val="Default Paragraph Font"/>
     <w:uiPriority w:val="1"/>
+    <w:semiHidden/>
     <w:unhideWhenUsed/>
   </w:style>
   <w:style w:type="table" w:default="1" w:styleId="TableNormal">

</xml_diff>